<commit_message>
feat(rag): ChatBulário substitui ANVISA (10k bulas PT-BR indexadas) + atualizar manuais
</commit_message>
<xml_diff>
--- a/docs/GUIA_DATASETS.docx
+++ b/docs/GUIA_DATASETS.docx
@@ -297,7 +297,7 @@
               <w:rPr>
                 <w:sz w:val="18"/>
               </w:rPr>
-              <w:t>🔲</w:t>
+              <w:t>✅</w:t>
             </w:r>
           </w:p>
         </w:tc>
@@ -334,7 +334,7 @@
               <w:rPr>
                 <w:sz w:val="18"/>
               </w:rPr>
-              <w:t>PRECISA BAIXAR</w:t>
+              <w:t>JÁ BAIXADO (HuggingFace)</w:t>
             </w:r>
           </w:p>
         </w:tc>
@@ -409,7 +409,7 @@
               <w:rPr>
                 <w:sz w:val="18"/>
               </w:rPr>
-              <w:t>PRECISA BAIXAR (ou subset)</w:t>
+              <w:t>OPCIONAL (subset)</w:t>
             </w:r>
           </w:p>
         </w:tc>
@@ -447,7 +447,7 @@
               <w:rPr>
                 <w:sz w:val="18"/>
               </w:rPr>
-              <w:t>🔲</w:t>
+              <w:t>✅</w:t>
             </w:r>
           </w:p>
         </w:tc>
@@ -466,7 +466,13 @@
                 <w:b/>
                 <w:sz w:val="18"/>
               </w:rPr>
-              <w:t>ANVISA Medicamentos</w:t>
+              <w:t>ChatBulário</w:t>
+            </w:r>
+            <w:r>
+              <w:rPr>
+                <w:sz w:val="18"/>
+              </w:rPr>
+              <w:t xml:space="preserve"> ⭐</w:t>
             </w:r>
           </w:p>
         </w:tc>
@@ -482,9 +488,23 @@
             </w:r>
             <w:r>
               <w:rPr>
+                <w:b/>
                 <w:sz w:val="18"/>
               </w:rPr>
-              <w:t>PRECISA BAIXAR CSV</w:t>
+              <w:t>JÁ BAIXADO</w:t>
+            </w:r>
+            <w:r>
+              <w:rPr>
+                <w:sz w:val="18"/>
+              </w:rPr>
+              <w:t xml:space="preserve"> em </w:t>
+            </w:r>
+            <w:r>
+              <w:rPr>
+                <w:rFonts w:ascii="Consolas" w:hAnsi="Consolas"/>
+                <w:sz w:val="18"/>
+              </w:rPr>
+              <w:t>data/raw/chatbulario_*.jsonl</w:t>
             </w:r>
           </w:p>
         </w:tc>
@@ -500,9 +520,10 @@
             </w:r>
             <w:r>
               <w:rPr>
+                <w:b/>
                 <w:sz w:val="18"/>
               </w:rPr>
-              <w:t>RAG #2 interno</w:t>
+              <w:t>RAG #2 interno (medicamentos)</w:t>
             </w:r>
           </w:p>
         </w:tc>
@@ -522,7 +543,7 @@
               <w:rPr>
                 <w:sz w:val="18"/>
               </w:rPr>
-              <w:t>🔲</w:t>
+              <w:t>✅</w:t>
             </w:r>
           </w:p>
         </w:tc>
@@ -559,7 +580,7 @@
               <w:rPr>
                 <w:sz w:val="18"/>
               </w:rPr>
-              <w:t>PRECISA BAIXAR</w:t>
+              <w:t>JÁ BAIXADO</w:t>
             </w:r>
           </w:p>
         </w:tc>
@@ -597,7 +618,7 @@
               <w:rPr>
                 <w:sz w:val="18"/>
               </w:rPr>
-              <w:t>🔲</w:t>
+              <w:t>✅</w:t>
             </w:r>
           </w:p>
         </w:tc>
@@ -634,7 +655,7 @@
               <w:rPr>
                 <w:sz w:val="18"/>
               </w:rPr>
-              <w:t>PRECISA BAIXAR CSV</w:t>
+              <w:t>JÁ BAIXADO</w:t>
             </w:r>
           </w:p>
         </w:tc>
@@ -709,7 +730,7 @@
               <w:rPr>
                 <w:sz w:val="18"/>
               </w:rPr>
-              <w:t>OPCIONAL (requer aprovação)</w:t>
+              <w:t>REJEITADO (requer aprovação + DUA)</w:t>
             </w:r>
           </w:p>
         </w:tc>
@@ -732,7 +753,112 @@
           </w:p>
         </w:tc>
       </w:tr>
+      <w:tr>
+        <w:tc>
+          <w:tcPr>
+            <w:tcW w:type="dxa" w:w="2160"/>
+          </w:tcPr>
+          <w:p>
+            <w:r>
+              <w:rPr>
+                <w:sz w:val="18"/>
+              </w:rPr>
+            </w:r>
+            <w:r>
+              <w:rPr>
+                <w:sz w:val="18"/>
+              </w:rPr>
+              <w:t>🗑️</w:t>
+            </w:r>
+          </w:p>
+        </w:tc>
+        <w:tc>
+          <w:tcPr>
+            <w:tcW w:type="dxa" w:w="2160"/>
+          </w:tcPr>
+          <w:p>
+            <w:r>
+              <w:rPr>
+                <w:sz w:val="18"/>
+              </w:rPr>
+            </w:r>
+            <w:r>
+              <w:rPr>
+                <w:sz w:val="18"/>
+              </w:rPr>
+              <w:t>~~ANVISA Medicamentos (CSV)~~</w:t>
+            </w:r>
+          </w:p>
+        </w:tc>
+        <w:tc>
+          <w:tcPr>
+            <w:tcW w:type="dxa" w:w="2160"/>
+          </w:tcPr>
+          <w:p>
+            <w:r>
+              <w:rPr>
+                <w:sz w:val="18"/>
+              </w:rPr>
+            </w:r>
+            <w:r>
+              <w:rPr>
+                <w:b/>
+                <w:sz w:val="18"/>
+              </w:rPr>
+              <w:t>SUBSTITUÍDO por ChatBulário</w:t>
+            </w:r>
+          </w:p>
+        </w:tc>
+        <w:tc>
+          <w:tcPr>
+            <w:tcW w:type="dxa" w:w="2160"/>
+          </w:tcPr>
+          <w:p>
+            <w:r>
+              <w:rPr>
+                <w:sz w:val="18"/>
+              </w:rPr>
+            </w:r>
+            <w:r>
+              <w:rPr>
+                <w:sz w:val="18"/>
+              </w:rPr>
+              <w:t>~~RAG #2 metadados~~</w:t>
+            </w:r>
+          </w:p>
+        </w:tc>
+      </w:tr>
     </w:tbl>
+    <w:p>
+      <w:r>
+        <w:rPr>
+          <w:b/>
+        </w:rPr>
+        <w:t>⭐ ATUALIZAÇÃO AGO/2026</w:t>
+      </w:r>
+      <w:r>
+        <w:t xml:space="preserve">: O dataset </w:t>
+      </w:r>
+      <w:r>
+        <w:rPr>
+          <w:rFonts w:ascii="Consolas" w:hAnsi="Consolas"/>
+          <w:sz w:val="20"/>
+        </w:rPr>
+        <w:t>anvisa_medicamentos.csv</w:t>
+      </w:r>
+      <w:r>
+        <w:t xml:space="preserve"> (que só tinha metadados: nome do remédio, classe terapêutica, registro) foi </w:t>
+      </w:r>
+      <w:r>
+        <w:rPr>
+          <w:b/>
+        </w:rPr>
+        <w:t>substituído pelo ChatBulário</w:t>
+      </w:r>
+      <w:r>
+        <w:t xml:space="preserve"> (pares pergunta-resposta com texto completo das bulas em PT-BR, 9 seções da RDC 47/2009). Detalhes na seção "ChatBulário" abaixo.</w:t>
+      </w:r>
+    </w:p>
     <w:p>
       <w:r>
         <w:rPr>
@@ -1247,6 +1373,320 @@
       </w:r>
       <w:r>
         <w:t>: CSV separado por ponto-e-vírgula</w:t>
+      </w:r>
+    </w:p>
+    <w:p>
+      <w:r>
+        <w:rPr>
+          <w:color w:val="CCCCCC"/>
+        </w:rPr>
+        <w:t>────────────────────────────────────────────────────────────</w:t>
+      </w:r>
+    </w:p>
+    <w:p>
+      <w:pPr>
+        <w:pStyle w:val="Heading3"/>
+      </w:pPr>
+      <w:r>
+        <w:rPr>
+          <w:color w:val="1F4E79"/>
+        </w:rPr>
+        <w:t>5. ⭐ **ChatBulário** (bulas PT-BR — substitui ANVISA)</w:t>
+      </w:r>
+    </w:p>
+    <w:p>
+      <w:pPr>
+        <w:pStyle w:val="ListBullet"/>
+      </w:pPr>
+      <w:r>
+        <w:rPr>
+          <w:b/>
+        </w:rPr>
+        <w:t>Por que</w:t>
+      </w:r>
+      <w:r>
+        <w:t xml:space="preserve">: dataset que combina </w:t>
+      </w:r>
+      <w:r>
+        <w:rPr>
+          <w:b/>
+        </w:rPr>
+        <w:t>todas as bulas de medicamentos ANVISA em formato pergunta-resposta em PT-BR</w:t>
+      </w:r>
+      <w:r>
+        <w:t>. Resolveu o problema do RAG multilíngue (que tinha ANVISA só com metadados + outras bases em inglês).</w:t>
+      </w:r>
+    </w:p>
+    <w:p>
+      <w:pPr>
+        <w:pStyle w:val="ListBullet"/>
+      </w:pPr>
+      <w:r>
+        <w:rPr>
+          <w:b/>
+        </w:rPr>
+        <w:t>Fonte</w:t>
+      </w:r>
+      <w:r>
+        <w:t>: https://huggingface.co/datasets/walmeidadf/ChatBulario</w:t>
+      </w:r>
+    </w:p>
+    <w:p>
+      <w:pPr>
+        <w:pStyle w:val="ListBullet"/>
+      </w:pPr>
+      <w:r>
+        <w:rPr>
+          <w:b/>
+        </w:rPr>
+        <w:t>Tamanho</w:t>
+      </w:r>
+      <w:r>
+        <w:t>: ~200 MB (3 splits JSONL)</w:t>
+      </w:r>
+    </w:p>
+    <w:p>
+      <w:pPr>
+        <w:pStyle w:val="ListBullet"/>
+      </w:pPr>
+      <w:r>
+        <w:rPr>
+          <w:b/>
+        </w:rPr>
+        <w:t>Formato</w:t>
+      </w:r>
+      <w:r>
+        <w:t xml:space="preserve">: JSONL com 18 colunas (nome, classe, princípio ativo, </w:t>
+      </w:r>
+      <w:r>
+        <w:rPr>
+          <w:b/>
+        </w:rPr>
+        <w:t>pergunta</w:t>
+      </w:r>
+      <w:r>
+        <w:t xml:space="preserve">, </w:t>
+      </w:r>
+      <w:r>
+        <w:rPr>
+          <w:b/>
+        </w:rPr>
+        <w:t>resposta</w:t>
+      </w:r>
+      <w:r>
+        <w:t>, seção, etc)</w:t>
+      </w:r>
+    </w:p>
+    <w:p>
+      <w:pPr>
+        <w:pStyle w:val="ListBullet"/>
+      </w:pPr>
+      <w:r>
+        <w:rPr>
+          <w:b/>
+        </w:rPr>
+        <w:t>Total</w:t>
+      </w:r>
+      <w:r>
+        <w:t xml:space="preserve">: </w:t>
+      </w:r>
+      <w:r>
+        <w:rPr>
+          <w:b/>
+        </w:rPr>
+        <w:t>68.938 pares Q&amp;A</w:t>
+      </w:r>
+      <w:r>
+        <w:t xml:space="preserve"> (~5.724 medicamentos únicos × ~12 perguntas cada)</w:t>
+      </w:r>
+    </w:p>
+    <w:p>
+      <w:pPr>
+        <w:pStyle w:val="ListBullet"/>
+      </w:pPr>
+      <w:r>
+        <w:rPr>
+          <w:b/>
+        </w:rPr>
+        <w:t>9 seções padronizadas</w:t>
+      </w:r>
+      <w:r>
+        <w:t xml:space="preserve"> (RDC 47/2009):</w:t>
+      </w:r>
+    </w:p>
+    <w:p>
+      <w:pPr>
+        <w:pStyle w:val="ListNumber"/>
+      </w:pPr>
+      <w:r>
+        <w:t>Para que é indicado</w:t>
+      </w:r>
+    </w:p>
+    <w:p>
+      <w:pPr>
+        <w:pStyle w:val="ListNumber"/>
+      </w:pPr>
+      <w:r>
+        <w:t>Como funciona</w:t>
+      </w:r>
+    </w:p>
+    <w:p>
+      <w:pPr>
+        <w:pStyle w:val="ListNumber"/>
+      </w:pPr>
+      <w:r>
+        <w:t>Quando não usar (contraindicações)</w:t>
+      </w:r>
+    </w:p>
+    <w:p>
+      <w:pPr>
+        <w:pStyle w:val="ListNumber"/>
+      </w:pPr>
+      <w:r>
+        <w:t>Cuidados antes de usar</w:t>
+      </w:r>
+    </w:p>
+    <w:p>
+      <w:pPr>
+        <w:pStyle w:val="ListNumber"/>
+      </w:pPr>
+      <w:r>
+        <w:t>Interações medicamentosas</w:t>
+      </w:r>
+    </w:p>
+    <w:p>
+      <w:pPr>
+        <w:pStyle w:val="ListNumber"/>
+      </w:pPr>
+      <w:r>
+        <w:t>Como usar (posologia)</w:t>
+      </w:r>
+    </w:p>
+    <w:p>
+      <w:pPr>
+        <w:pStyle w:val="ListNumber"/>
+      </w:pPr>
+      <w:r>
+        <w:t>Efeitos adversos</w:t>
+      </w:r>
+    </w:p>
+    <w:p>
+      <w:pPr>
+        <w:pStyle w:val="ListNumber"/>
+      </w:pPr>
+      <w:r>
+        <w:t>O que fazer se esquecer</w:t>
+      </w:r>
+    </w:p>
+    <w:p>
+      <w:pPr>
+        <w:pStyle w:val="ListNumber"/>
+      </w:pPr>
+      <w:r>
+        <w:t>Superdosagem</w:t>
+      </w:r>
+    </w:p>
+    <w:p>
+      <w:r>
+        <w:rPr>
+          <w:b/>
+        </w:rPr>
+        <w:t>Download via Python</w:t>
+      </w:r>
+      <w:r>
+        <w:t>:</w:t>
+      </w:r>
+    </w:p>
+    <w:p>
+      <w:r>
+        <w:rPr>
+          <w:rFonts w:ascii="Consolas" w:hAnsi="Consolas"/>
+          <w:sz w:val="18"/>
+        </w:rPr>
+        <w:t>from datasets import load_dataset</w:t>
+        <w:br/>
+        <w:br/>
+        <w:t># Baixa pra data/raw/</w:t>
+        <w:br/>
+        <w:t>ds = load_dataset(</w:t>
+        <w:br/>
+        <w:t xml:space="preserve">    "walmeidadf/ChatBulario",</w:t>
+        <w:br/>
+        <w:t xml:space="preserve">    cache_dir="data/raw"</w:t>
+        <w:br/>
+        <w:t>)</w:t>
+        <w:br/>
+        <w:br/>
+        <w:t># Salvar em JSONL</w:t>
+        <w:br/>
+        <w:t>import json</w:t>
+        <w:br/>
+        <w:t>for split in ["train", "validation", "test"]:</w:t>
+        <w:br/>
+        <w:t xml:space="preserve">    with open(f"data/raw/chatbulario_{split}.jsonl", "w", encoding="utf-8") as f:</w:t>
+        <w:br/>
+        <w:t xml:space="preserve">        for sample in ds[split]:</w:t>
+        <w:br/>
+        <w:t xml:space="preserve">            f.write(json.dumps(sample, ensure_ascii=False) + "\n")</w:t>
+      </w:r>
+    </w:p>
+    <w:p>
+      <w:r>
+        <w:rPr>
+          <w:b/>
+        </w:rPr>
+        <w:t>Indexar no ChromaDB</w:t>
+      </w:r>
+      <w:r>
+        <w:t>:</w:t>
+      </w:r>
+    </w:p>
+    <w:p>
+      <w:r>
+        <w:rPr>
+          <w:rFonts w:ascii="Consolas" w:hAnsi="Consolas"/>
+          <w:sz w:val="18"/>
+        </w:rPr>
+        <w:t># Indexar TODAS as 68k (demora ~35min em CPU)</w:t>
+        <w:br/>
+        <w:t>python src/rag/build_index_chatbulario.py</w:t>
+        <w:br/>
+        <w:br/>
+        <w:t># OU só 10k pra teste rápido (~5min)</w:t>
+        <w:br/>
+        <w:t>python src/rag/build_index_chatbulario.py 10000</w:t>
+      </w:r>
+    </w:p>
+    <w:p>
+      <w:r>
+        <w:rPr>
+          <w:b/>
+        </w:rPr>
+        <w:t>Por que essa mudança foi crítica</w:t>
+      </w:r>
+      <w:r>
+        <w:t xml:space="preserve">: o </w:t>
+      </w:r>
+      <w:r>
+        <w:rPr>
+          <w:rFonts w:ascii="Consolas" w:hAnsi="Consolas"/>
+          <w:sz w:val="20"/>
+        </w:rPr>
+        <w:t>anvisa_medicamentos.csv</w:t>
+      </w:r>
+      <w:r>
+        <w:t xml:space="preserve"> original só tinha metadados (ex: "Paracetamol | ANALGESICOS"), o que limitava o RAG a buscar por nome. Com o ChatBulário, o sistema agora responde "efeitos colaterais de paracetamol", "posologia de ibuprofeno", "interação medicamentosa de AAS" — impossível antes.</w:t>
+      </w:r>
+    </w:p>
+    <w:p>
+      <w:r>
+        <w:rPr>
+          <w:b/>
+        </w:rPr>
+        <w:t>Limitação conhecida</w:t>
+      </w:r>
+      <w:r>
+        <w:t>: o ChatBulário só cobre medicamentos com bulas completas no Bulário Eletrônico ANVISA. Medicamentos muito novos ou antigos podem estar faltando.</w:t>
       </w:r>
     </w:p>
     <w:p>

</xml_diff>